<commit_message>
Clean English templates and complete German and French translations
</commit_message>
<xml_diff>
--- a/Template_Permit_to_Work_EN.docx
+++ b/Template_Permit_to_Work_EN.docx
@@ -18,7 +18,7 @@
           <w:sz w:val="32"/>
           <w:szCs w:val="32"/>
         </w:rPr>
-        <w:t xml:space="preserve">PERMIT TO WORK — PROCEDURE</w:t>
+        <w:t>PERMIT TO WORK PROCEDURE</w:t>
       </w:r>
     </w:p>
     <w:p>
@@ -61,6 +61,9 @@
         <w:gridCol w:w="7066"/>
       </w:tblGrid>
       <w:tr>
+        <w:trPr>
+          <w:cantSplit/>
+        </w:trPr>
         <w:tc>
           <w:tcPr>
             <w:tcW w:type="dxa" w:w="3400"/>
@@ -133,7 +136,7 @@
                 <w:sz w:val="22"/>
                 <w:szCs w:val="22"/>
               </w:rPr>
-              <w:t xml:space="preserve">A structured process that ensures high-risk, non-routine work is planned, assessed, and controlled before it begins.</w:t>
+              <w:t>A permit to work records how high-risk, non-routine work will be planned and controlled before it starts.</w:t>
             </w:r>
           </w:p>
           <w:p>
@@ -151,7 +154,7 @@
                 <w:sz w:val="22"/>
                 <w:szCs w:val="22"/>
               </w:rPr>
-              <w:t xml:space="preserve">A documented agreement between the person authorising the work and the person carrying it out — covering the scope, hazards, controls, and responsibilities.</w:t>
+              <w:t>It identifies the scope, hazards, controls and responsibilities agreed by the person authorising the work and the person carrying it out.</w:t>
             </w:r>
           </w:p>
           <w:p>
@@ -169,12 +172,15 @@
                 <w:sz w:val="22"/>
                 <w:szCs w:val="22"/>
               </w:rPr>
-              <w:t xml:space="preserve">A practical tool that helps supervisors and workers think through the job together before starting.</w:t>
+              <w:t>Supervisors and workers review the job together before starting.</w:t>
             </w:r>
           </w:p>
         </w:tc>
       </w:tr>
       <w:tr>
+        <w:trPr>
+          <w:cantSplit/>
+        </w:trPr>
         <w:tc>
           <w:tcPr>
             <w:tcW w:type="dxa" w:w="3400"/>
@@ -210,7 +216,7 @@
                 <w:sz w:val="22"/>
                 <w:szCs w:val="22"/>
               </w:rPr>
-              <w:t xml:space="preserve">What it is not</w:t>
+              <w:t>Responsibilities</w:t>
             </w:r>
           </w:p>
         </w:tc>
@@ -247,7 +253,7 @@
                 <w:sz w:val="22"/>
                 <w:szCs w:val="22"/>
               </w:rPr>
-              <w:t xml:space="preserve">Not a bureaucratic formality or a signature exercise.</w:t>
+              <w:t>Agree and implement the controls before signing the permit.</w:t>
             </w:r>
           </w:p>
           <w:p>
@@ -265,7 +271,7 @@
                 <w:sz w:val="22"/>
                 <w:szCs w:val="22"/>
               </w:rPr>
-              <w:t xml:space="preserve">Not a replacement for competence — the permit does not make the job safe; the controls do.</w:t>
+              <w:t>The work requires competent people and the agreed controls to be in place.</w:t>
             </w:r>
           </w:p>
           <w:p>
@@ -283,12 +289,15 @@
                 <w:sz w:val="22"/>
                 <w:szCs w:val="22"/>
               </w:rPr>
-              <w:t xml:space="preserve">Not a transfer of responsibility — the employer’s duty of care remains throughout.</w:t>
+              <w:t>The employer retains their duty of care throughout the work.</w:t>
             </w:r>
           </w:p>
         </w:tc>
       </w:tr>
       <w:tr>
+        <w:trPr>
+          <w:cantSplit/>
+        </w:trPr>
         <w:tc>
           <w:tcPr>
             <w:tcW w:type="dxa" w:w="3400"/>
@@ -324,7 +333,7 @@
                 <w:sz w:val="22"/>
                 <w:szCs w:val="22"/>
               </w:rPr>
-              <w:t xml:space="preserve">Why we do it</w:t>
+              <w:t>Employer duties</w:t>
             </w:r>
           </w:p>
         </w:tc>
@@ -361,7 +370,7 @@
                 <w:sz w:val="22"/>
                 <w:szCs w:val="22"/>
               </w:rPr>
-              <w:t xml:space="preserve">The employer has a general duty to take all measures necessary to prevent accidents and protect health (VUV Art. 3). This includes providing and maintaining protective equipment and safe systems of work.</w:t>
+              <w:t>The employer must take the measures necessary to prevent accidents and protect health (VUV Art. 3), including providing and maintaining protective equipment and safe systems of work.</w:t>
             </w:r>
           </w:p>
           <w:p>
@@ -379,7 +388,7 @@
                 <w:sz w:val="22"/>
                 <w:szCs w:val="22"/>
               </w:rPr>
-              <w:t xml:space="preserve">The employer must inform and instruct all workers — including contractor workers on site — about the hazards of their tasks and the safety measures in place. This must happen before work starts and whenever conditions change (VUV Art. 6).</w:t>
+              <w:t>The employer must inform and instruct all workers, including contractor workers on site, about the hazards and safety measures before work starts and whenever conditions change (VUV Art. 6).</w:t>
             </w:r>
           </w:p>
           <w:p>
@@ -397,7 +406,7 @@
                 <w:sz w:val="22"/>
                 <w:szCs w:val="22"/>
               </w:rPr>
-              <w:t xml:space="preserve">For work with special dangers (VUV Art. 8), the employer may only assign trained workers. When a worker performs dangerous work alone, the employer must arrange for supervision — but this does not mean standing next to them all day. It means having a system that ensures they are not abandoned: the right planning, agreed controls, periodic checks, and a clear way to call for help.</w:t>
+              <w:t>The employer must assign workers trained for the task to work involving special dangers (VUV Art. 8). If dangerous work is carried out alone, the employer must arrange supervision appropriate to the hazards, with agreed controls, checks and a way to call for help.</w:t>
             </w:r>
           </w:p>
           <w:p>
@@ -415,7 +424,7 @@
                 <w:sz w:val="22"/>
                 <w:szCs w:val="22"/>
               </w:rPr>
-              <w:t xml:space="preserve">The PTW system is the practical method for meeting these obligations. The permit creates a traceable record that hazards were identified, controls were agreed, and workers were briefed — protecting both the company and its people.</w:t>
+              <w:t>The permit records the hazards identified, controls agreed and briefing given to the workers. It supports the planning and supervision required for the work.</w:t>
             </w:r>
           </w:p>
         </w:tc>
@@ -456,6 +465,9 @@
         <w:gridCol w:w="7066"/>
       </w:tblGrid>
       <w:tr>
+        <w:trPr>
+          <w:cantSplit/>
+        </w:trPr>
         <w:tc>
           <w:tcPr>
             <w:tcW w:type="dxa" w:w="3400"/>
@@ -528,7 +540,7 @@
                 <w:sz w:val="22"/>
                 <w:szCs w:val="22"/>
               </w:rPr>
-              <w:t xml:space="preserve">The supervisor or manager who authorises the work in their area. Typically: Abteilungsleiter, Produktionsleiter, Schichtleiter, or the person giving the order (Auftraggeber).</w:t>
+              <w:t>The supervisor or manager who authorises work in their area, such as the department manager, production manager, shift supervisor or person commissioning the work.</w:t>
             </w:r>
           </w:p>
           <w:p>
@@ -564,12 +576,15 @@
                 <w:sz w:val="22"/>
                 <w:szCs w:val="22"/>
               </w:rPr>
-              <w:t xml:space="preserve">In practice: verifies the site is safe, co-signs the permit, checks compliance periodically, closes the permit. Does not need to watch continuously — needs to ensure the system works.</w:t>
+              <w:t>Inspects the site, co-signs the permit, checks periodically that the controls are followed and closes the permit.</w:t>
             </w:r>
           </w:p>
         </w:tc>
       </w:tr>
       <w:tr>
+        <w:trPr>
+          <w:cantSplit/>
+        </w:trPr>
         <w:tc>
           <w:tcPr>
             <w:tcW w:type="dxa" w:w="3400"/>
@@ -642,7 +657,7 @@
                 <w:sz w:val="22"/>
                 <w:szCs w:val="22"/>
               </w:rPr>
-              <w:t xml:space="preserve">The person leading the work. For internal teams: Vorarbeiter or team leader. For contractors: their site foreman.</w:t>
+              <w:t>The person leading the work: a foreman or team leader for internal teams, or the contractor’s site foreman.</w:t>
             </w:r>
           </w:p>
           <w:p>
@@ -660,7 +675,7 @@
                 <w:sz w:val="22"/>
                 <w:szCs w:val="22"/>
               </w:rPr>
-              <w:t xml:space="preserve">Requests the permit, identifies hazards and controls together with the Responsible Person, briefs the team, ensures all workers comply. Accountable for the execution.</w:t>
+              <w:t>Requests the permit, agrees the hazards and controls with the Responsible Person, briefs the team and ensures all workers comply. Responsible for carrying out the work.</w:t>
             </w:r>
           </w:p>
           <w:p>
@@ -678,12 +693,15 @@
                 <w:sz w:val="22"/>
                 <w:szCs w:val="22"/>
               </w:rPr>
-              <w:t xml:space="preserve">Under VUV Art. 11, all workers must follow safety instructions and support the employer in implementing safety measures. The Work Leader is the first line of this on the ground.</w:t>
+              <w:t>Under VUV Art. 11, workers must follow safety instructions and support the employer in implementing safety measures. The Work Leader checks that the team follows the agreed controls.</w:t>
             </w:r>
           </w:p>
         </w:tc>
       </w:tr>
       <w:tr>
+        <w:trPr>
+          <w:cantSplit/>
+        </w:trPr>
         <w:tc>
           <w:tcPr>
             <w:tcW w:type="dxa" w:w="3400"/>
@@ -756,7 +774,7 @@
                 <w:sz w:val="22"/>
                 <w:szCs w:val="22"/>
               </w:rPr>
-              <w:t xml:space="preserve">Standby Person (confined space): stationed at the entry, controls access, monitors atmosphere, initiates rescue. Dedicated — no other tasks during entry.</w:t>
+              <w:t>Standby Person (confined space): stays at the entry, controls access, monitors the atmosphere, raises the alarm and activates the rescue plan. No other duties while anyone is inside the confined space.</w:t>
             </w:r>
           </w:p>
           <w:p>
@@ -774,7 +792,7 @@
                 <w:sz w:val="22"/>
                 <w:szCs w:val="22"/>
               </w:rPr>
-              <w:t xml:space="preserve">Fire Watch (hot work): monitors for fire during and for min. 30 minutes after hot work. Knows extinguisher location and alarm procedure.</w:t>
+              <w:t>Fire Watch (hot work): watches for fire during the work and for at least 30 minutes afterwards. Knows where the extinguishers are and how to raise the alarm.</w:t>
             </w:r>
           </w:p>
           <w:p>
@@ -792,12 +810,15 @@
                 <w:sz w:val="22"/>
                 <w:szCs w:val="22"/>
               </w:rPr>
-              <w:t xml:space="preserve">These are task assignments on the permit, not permanent roles. Assigned by name for each job.</w:t>
+              <w:t>Assign these safety tasks by name on the permit for each job.</w:t>
             </w:r>
           </w:p>
         </w:tc>
       </w:tr>
       <w:tr>
+        <w:trPr>
+          <w:cantSplit/>
+        </w:trPr>
         <w:tc>
           <w:tcPr>
             <w:tcW w:type="dxa" w:w="3400"/>
@@ -870,7 +891,7 @@
                 <w:sz w:val="22"/>
                 <w:szCs w:val="22"/>
               </w:rPr>
-              <w:t xml:space="preserve">Read and sign the permit before starting. Follow all agreed controls. STOP work and report immediately if conditions change.</w:t>
+              <w:t>Read and sign the permit before starting. Follow the agreed controls. STOP WORK and report immediately if conditions change.</w:t>
             </w:r>
           </w:p>
           <w:p>
@@ -930,6 +951,9 @@
         <w:gridCol w:w="7866"/>
       </w:tblGrid>
       <w:tr>
+        <w:trPr>
+          <w:cantSplit/>
+        </w:trPr>
         <w:tc>
           <w:tcPr>
             <w:tcW w:type="dxa" w:w="600"/>
@@ -1049,6 +1073,9 @@
         </w:tc>
       </w:tr>
       <w:tr>
+        <w:trPr>
+          <w:cantSplit/>
+        </w:trPr>
         <w:tc>
           <w:tcPr>
             <w:tcW w:type="dxa" w:w="600"/>
@@ -1158,7 +1185,7 @@
                 <w:sz w:val="22"/>
                 <w:szCs w:val="22"/>
               </w:rPr>
-              <w:t xml:space="preserve">The Work Leader defines the scope: what, where, how, with what tools (Section 1 of the permit).</w:t>
+              <w:t>The Work Leader describes what will be done, where, how and with which tools (Section 1).</w:t>
             </w:r>
           </w:p>
           <w:p>
@@ -1176,12 +1203,15 @@
                 <w:sz w:val="22"/>
                 <w:szCs w:val="22"/>
               </w:rPr>
-              <w:t xml:space="preserve">Contact the Responsible Person to initiate the permit process.</w:t>
+              <w:t>Contact the Responsible Person to start the permit process.</w:t>
             </w:r>
           </w:p>
         </w:tc>
       </w:tr>
       <w:tr>
+        <w:trPr>
+          <w:cantSplit/>
+        </w:trPr>
         <w:tc>
           <w:tcPr>
             <w:tcW w:type="dxa" w:w="600"/>
@@ -1291,7 +1321,7 @@
                 <w:sz w:val="22"/>
                 <w:szCs w:val="22"/>
               </w:rPr>
-              <w:t xml:space="preserve">Together, identify which permits are needed (Section 2 — trigger table).</w:t>
+              <w:t>Together, identify the permits and other actions required using the activity table in Section 2.</w:t>
             </w:r>
           </w:p>
           <w:p>
@@ -1309,7 +1339,7 @@
                 <w:sz w:val="22"/>
                 <w:szCs w:val="22"/>
               </w:rPr>
-              <w:t xml:space="preserve">Walk through the job step by step. For each step, identify hazards and agree controls (Section 3 — Job Hazard Analysis).</w:t>
+              <w:t>Review each work step, identify its hazards and agree the controls (Section 3).</w:t>
             </w:r>
           </w:p>
           <w:p>
@@ -1333,6 +1363,9 @@
         </w:tc>
       </w:tr>
       <w:tr>
+        <w:trPr>
+          <w:cantSplit/>
+        </w:trPr>
         <w:tc>
           <w:tcPr>
             <w:tcW w:type="dxa" w:w="600"/>
@@ -1460,12 +1493,15 @@
                 <w:sz w:val="22"/>
                 <w:szCs w:val="22"/>
               </w:rPr>
-              <w:t xml:space="preserve">Complete all required permits. Assign specific safety tasks (standby, fire watch) by name.</w:t>
+              <w:t>Complete the required permits. Assign safety tasks, including standby and fire watch, by name.</w:t>
             </w:r>
           </w:p>
         </w:tc>
       </w:tr>
       <w:tr>
+        <w:trPr>
+          <w:cantSplit/>
+        </w:trPr>
         <w:tc>
           <w:tcPr>
             <w:tcW w:type="dxa" w:w="600"/>
@@ -1575,7 +1611,7 @@
                 <w:sz w:val="22"/>
                 <w:szCs w:val="22"/>
               </w:rPr>
-              <w:t xml:space="preserve">Responsible Person inspects the site to confirm controls are in place.</w:t>
+              <w:t>The Responsible Person inspects the site and confirms that the controls are in place.</w:t>
             </w:r>
           </w:p>
           <w:p>
@@ -1599,6 +1635,9 @@
         </w:tc>
       </w:tr>
       <w:tr>
+        <w:trPr>
+          <w:cantSplit/>
+        </w:trPr>
         <w:tc>
           <w:tcPr>
             <w:tcW w:type="dxa" w:w="600"/>
@@ -1726,12 +1765,15 @@
                 <w:sz w:val="22"/>
                 <w:szCs w:val="22"/>
               </w:rPr>
-              <w:t xml:space="preserve">If conditions change or new hazards arise: STOP WORK. Re-assess before continuing.</w:t>
+              <w:t>If conditions change or new hazards arise: STOP WORK. Reassess before continuing.</w:t>
             </w:r>
           </w:p>
         </w:tc>
       </w:tr>
       <w:tr>
+        <w:trPr>
+          <w:cantSplit/>
+        </w:trPr>
         <w:tc>
           <w:tcPr>
             <w:tcW w:type="dxa" w:w="600"/>
@@ -1841,7 +1883,7 @@
                 <w:sz w:val="22"/>
                 <w:szCs w:val="22"/>
               </w:rPr>
-              <w:t xml:space="preserve">Both inspect the area. Remove isolations. Confirm safe and tidy. Both sign closure.</w:t>
+              <w:t>Both inspect the area. Remove isolations. Confirm that the area is safe and tidy. Both sign the closure.</w:t>
             </w:r>
           </w:p>
         </w:tc>
@@ -1862,7 +1904,7 @@
           <w:sz w:val="26"/>
           <w:szCs w:val="26"/>
         </w:rPr>
-        <w:t xml:space="preserve">SUSPENSION, EXTENSION &amp; CANCELLATION</w:t>
+        <w:t>SUSPENSION EXTENSION AND CANCELLATION</w:t>
       </w:r>
     </w:p>
     <w:tbl>
@@ -1882,6 +1924,9 @@
         <w:gridCol w:w="8066"/>
       </w:tblGrid>
       <w:tr>
+        <w:trPr>
+          <w:cantSplit/>
+        </w:trPr>
         <w:tc>
           <w:tcPr>
             <w:tcW w:type="dxa" w:w="2400"/>
@@ -1961,6 +2006,9 @@
         </w:tc>
       </w:tr>
       <w:tr>
+        <w:trPr>
+          <w:cantSplit/>
+        </w:trPr>
         <w:tc>
           <w:tcPr>
             <w:tcW w:type="dxa" w:w="2400"/>
@@ -2034,12 +2082,15 @@
                 <w:sz w:val="22"/>
                 <w:szCs w:val="22"/>
               </w:rPr>
-              <w:t xml:space="preserve">Same work, same conditions next day: both re-inspect and sign the extension. Max. 5 days — then issue a new permit.</w:t>
+              <w:t>For the same work under unchanged conditions the next day, both re-inspect and sign the extension. Maximum 5 days; then issue a new permit.</w:t>
             </w:r>
           </w:p>
         </w:tc>
       </w:tr>
       <w:tr>
+        <w:trPr>
+          <w:cantSplit/>
+        </w:trPr>
         <w:tc>
           <w:tcPr>
             <w:tcW w:type="dxa" w:w="2400"/>
@@ -2113,7 +2164,7 @@
                 <w:sz w:val="22"/>
                 <w:szCs w:val="22"/>
               </w:rPr>
-              <w:t xml:space="preserve">If conditions fundamentally change, the permit is cancelled. A new permit with a fresh assessment is required.</w:t>
+              <w:t>Cancel the permit if conditions fundamentally change. Complete a new assessment and issue a new permit.</w:t>
             </w:r>
           </w:p>
         </w:tc>
@@ -2152,7 +2203,7 @@
           <w:sz w:val="22"/>
           <w:szCs w:val="22"/>
         </w:rPr>
-        <w:t xml:space="preserve">Log all permits in the Permit Activity Register. File completed permits for a minimum of 2 years.</w:t>
+        <w:t>Log all permits in the Permit Activity Register. Keep completed permits for at least 2 years.</w:t>
       </w:r>
     </w:p>
     <w:p>
@@ -2176,7 +2227,7 @@
           <w:sz w:val="32"/>
           <w:szCs w:val="32"/>
         </w:rPr>
-        <w:t xml:space="preserve">PERMIT TO WORK — QUICK REFERENCE</w:t>
+        <w:t>PERMIT TO WORK QUICK REFERENCE</w:t>
       </w:r>
     </w:p>
     <w:p>
@@ -2195,7 +2246,7 @@
           <w:sz w:val="20"/>
           <w:szCs w:val="20"/>
         </w:rPr>
-        <w:t xml:space="preserve">Post at permit issuing station</w:t>
+        <w:t>Display at the permit issuing point</w:t>
       </w:r>
     </w:p>
     <w:p>
@@ -2238,6 +2289,9 @@
         <w:gridCol w:w="7666"/>
       </w:tblGrid>
       <w:tr>
+        <w:trPr>
+          <w:cantSplit/>
+        </w:trPr>
         <w:tc>
           <w:tcPr>
             <w:tcW w:type="dxa" w:w="2800"/>
@@ -2370,6 +2424,9 @@
         </w:tc>
       </w:tr>
       <w:tr>
+        <w:trPr>
+          <w:cantSplit/>
+        </w:trPr>
         <w:tc>
           <w:tcPr>
             <w:tcW w:type="dxa" w:w="2800"/>
@@ -2501,6 +2558,9 @@
         <w:gridCol w:w="7666"/>
       </w:tblGrid>
       <w:tr>
+        <w:trPr>
+          <w:cantSplit/>
+        </w:trPr>
         <w:tc>
           <w:tcPr>
             <w:tcW w:type="dxa" w:w="2800"/>
@@ -2580,6 +2640,9 @@
         </w:tc>
       </w:tr>
       <w:tr>
+        <w:trPr>
+          <w:cantSplit/>
+        </w:trPr>
         <w:tc>
           <w:tcPr>
             <w:tcW w:type="dxa" w:w="2800"/>
@@ -2659,6 +2722,9 @@
         </w:tc>
       </w:tr>
       <w:tr>
+        <w:trPr>
+          <w:cantSplit/>
+        </w:trPr>
         <w:tc>
           <w:tcPr>
             <w:tcW w:type="dxa" w:w="2800"/>
@@ -2732,7 +2798,7 @@
                 <w:sz w:val="22"/>
                 <w:szCs w:val="22"/>
               </w:rPr>
-              <w:t xml:space="preserve">Assigned by name on the permit for confined space entry or hot work. Dedicated to that task — no other duties during the work.</w:t>
+              <w:t>Assign by name on the permit. The standby person has no other duties while anyone is inside the confined space. The fire watch monitors fire risk during hot work and the required post-work period, with no other duties.</w:t>
             </w:r>
           </w:p>
         </w:tc>
@@ -2777,6 +2843,9 @@
         <w:gridCol w:w="1746"/>
       </w:tblGrid>
       <w:tr>
+        <w:trPr>
+          <w:cantSplit/>
+        </w:trPr>
         <w:tc>
           <w:tcPr>
             <w:tcW w:type="dxa" w:w="1744"/>
@@ -3013,6 +3082,9 @@
         </w:tc>
       </w:tr>
       <w:tr>
+        <w:trPr>
+          <w:cantSplit/>
+        </w:trPr>
         <w:tc>
           <w:tcPr>
             <w:tcW w:type="dxa" w:w="1744"/>
@@ -3085,7 +3157,7 @@
                 <w:sz w:val="20"/>
                 <w:szCs w:val="20"/>
               </w:rPr>
-              <w:t xml:space="preserve">Identify hazards &amp; controls together</w:t>
+              <w:t>Agree hazards and controls together</w:t>
             </w:r>
           </w:p>
         </w:tc>
@@ -3199,7 +3271,7 @@
                 <w:sz w:val="20"/>
                 <w:szCs w:val="20"/>
               </w:rPr>
-              <w:t xml:space="preserve">Work per permit. Check periodically. Stop if change</w:t>
+              <w:t>Work within the permit. Check periodically. Stop if conditions change</w:t>
             </w:r>
           </w:p>
         </w:tc>
@@ -3279,6 +3351,9 @@
         <w:gridCol w:w="2866"/>
       </w:tblGrid>
       <w:tr>
+        <w:trPr>
+          <w:cantSplit/>
+        </w:trPr>
         <w:tc>
           <w:tcPr>
             <w:tcW w:type="dxa" w:w="2800"/>
@@ -3398,6 +3473,9 @@
         </w:tc>
       </w:tr>
       <w:tr>
+        <w:trPr>
+          <w:cantSplit/>
+        </w:trPr>
         <w:tc>
           <w:tcPr>
             <w:tcW w:type="dxa" w:w="2800"/>
@@ -3470,7 +3548,7 @@
                 <w:sz w:val="22"/>
                 <w:szCs w:val="22"/>
               </w:rPr>
-              <w:t xml:space="preserve">All permitted work — always the base document</w:t>
+              <w:t>Base document for all work requiring a permit</w:t>
             </w:r>
           </w:p>
         </w:tc>
@@ -3514,6 +3592,9 @@
         </w:tc>
       </w:tr>
       <w:tr>
+        <w:trPr>
+          <w:cantSplit/>
+        </w:trPr>
         <w:tc>
           <w:tcPr>
             <w:tcW w:type="dxa" w:w="2800"/>
@@ -3630,6 +3711,9 @@
         </w:tc>
       </w:tr>
       <w:tr>
+        <w:trPr>
+          <w:cantSplit/>
+        </w:trPr>
         <w:tc>
           <w:tcPr>
             <w:tcW w:type="dxa" w:w="2800"/>
@@ -3746,6 +3830,9 @@
         </w:tc>
       </w:tr>
       <w:tr>
+        <w:trPr>
+          <w:cantSplit/>
+        </w:trPr>
         <w:tc>
           <w:tcPr>
             <w:tcW w:type="dxa" w:w="2800"/>
@@ -3862,6 +3949,9 @@
         </w:tc>
       </w:tr>
       <w:tr>
+        <w:trPr>
+          <w:cantSplit/>
+        </w:trPr>
         <w:tc>
           <w:tcPr>
             <w:tcW w:type="dxa" w:w="2800"/>
@@ -4012,6 +4102,9 @@
         <w:gridCol w:w="10466"/>
       </w:tblGrid>
       <w:tr>
+        <w:trPr>
+          <w:cantSplit/>
+        </w:trPr>
         <w:tc>
           <w:tcPr>
             <w:tcW w:type="dxa" w:w="10466"/>
@@ -4046,7 +4139,7 @@
                 <w:sz w:val="22"/>
                 <w:szCs w:val="22"/>
               </w:rPr>
-              <w:t xml:space="preserve">•  The permit does not make the job safe — the controls do.</w:t>
+              <w:t>•  Implement the agreed controls before starting work.</w:t>
             </w:r>
           </w:p>
           <w:p>
@@ -4064,7 +4157,7 @@
                 <w:sz w:val="22"/>
                 <w:szCs w:val="22"/>
               </w:rPr>
-              <w:t xml:space="preserve">•  If conditions change: STOP WORK. Re-assess before continuing.</w:t>
+              <w:t>•  If conditions change: STOP WORK. Reassess before continuing.</w:t>
             </w:r>
           </w:p>
           <w:p>
@@ -4168,7 +4261,7 @@
     </w:p>
     <w:p>
       <w:pPr>
-        <w:spacing w:after="0" w:before="40"/>
+        <w:spacing w:after="0" w:before="0" w:line="40" w:lineRule="exact"/>
       </w:pPr>
     </w:p>
     <w:tbl>
@@ -4190,6 +4283,9 @@
         <w:gridCol w:w="2066"/>
       </w:tblGrid>
       <w:tr>
+        <w:trPr>
+          <w:cantSplit/>
+        </w:trPr>
         <w:tc>
           <w:tcPr>
             <w:tcW w:type="dxa" w:w="2800"/>
@@ -4346,6 +4442,9 @@
         </w:tc>
       </w:tr>
       <w:tr>
+        <w:trPr>
+          <w:cantSplit/>
+        </w:trPr>
         <w:tc>
           <w:tcPr>
             <w:tcW w:type="dxa" w:w="2800"/>
@@ -4425,6 +4524,9 @@
         </w:tc>
       </w:tr>
       <w:tr>
+        <w:trPr>
+          <w:cantSplit/>
+        </w:trPr>
         <w:tc>
           <w:tcPr>
             <w:tcW w:type="dxa" w:w="2800"/>
@@ -4581,6 +4683,9 @@
         </w:tc>
       </w:tr>
       <w:tr>
+        <w:trPr>
+          <w:cantSplit/>
+        </w:trPr>
         <w:tc>
           <w:tcPr>
             <w:tcW w:type="dxa" w:w="2800"/>
@@ -4660,6 +4765,9 @@
         </w:tc>
       </w:tr>
       <w:tr>
+        <w:trPr>
+          <w:cantSplit/>
+        </w:trPr>
         <w:tc>
           <w:tcPr>
             <w:tcW w:type="dxa" w:w="2800"/>
@@ -4741,7 +4849,7 @@
     </w:tbl>
     <w:p>
       <w:pPr>
-        <w:spacing w:after="40" w:before="140"/>
+        <w:spacing w:after="40" w:before="80"/>
       </w:pPr>
       <w:r>
         <w:rPr>
@@ -4776,6 +4884,7 @@
       <w:tr>
         <w:trPr>
           <w:trHeight w:val="400" w:hRule="atLeast"/>
+          <w:cantSplit/>
         </w:trPr>
         <w:tc>
           <w:tcPr>
@@ -4858,6 +4967,7 @@
       <w:tr>
         <w:trPr>
           <w:trHeight w:val="320" w:hRule="atLeast"/>
+          <w:cantSplit/>
         </w:trPr>
         <w:tc>
           <w:tcPr>
@@ -4940,6 +5050,7 @@
       <w:tr>
         <w:trPr>
           <w:trHeight w:val="480" w:hRule="atLeast"/>
+          <w:cantSplit/>
         </w:trPr>
         <w:tc>
           <w:tcPr>
@@ -4976,7 +5087,7 @@
                 <w:sz w:val="22"/>
                 <w:szCs w:val="22"/>
               </w:rPr>
-              <w:t xml:space="preserve">How? (key steps — describe the sequence)</w:t>
+              <w:t>How? (main steps in order)</w:t>
             </w:r>
           </w:p>
         </w:tc>
@@ -5022,6 +5133,7 @@
       <w:tr>
         <w:trPr>
           <w:trHeight w:val="300" w:hRule="atLeast"/>
+          <w:cantSplit/>
         </w:trPr>
         <w:tc>
           <w:tcPr>
@@ -5058,7 +5170,7 @@
                 <w:sz w:val="22"/>
                 <w:szCs w:val="22"/>
               </w:rPr>
-              <w:t xml:space="preserve">Tools and equipment needed</w:t>
+              <w:t>Tools and equipment</w:t>
             </w:r>
           </w:p>
         </w:tc>
@@ -5104,7 +5216,7 @@
     </w:tbl>
     <w:p>
       <w:pPr>
-        <w:spacing w:after="40" w:before="140"/>
+        <w:spacing w:after="40" w:before="80"/>
       </w:pPr>
       <w:r>
         <w:rPr>
@@ -5135,7 +5247,7 @@
           <w:sz w:val="20"/>
           <w:szCs w:val="20"/>
         </w:rPr>
-        <w:t xml:space="preserve">Tick all that apply — each ticked item requires the corresponding permit.</w:t>
+        <w:t>Tick all that apply. Obtain the listed additional permits and carry out any other required actions.</w:t>
       </w:r>
     </w:p>
     <w:tbl>
@@ -5157,6 +5269,9 @@
         <w:gridCol w:w="2666"/>
       </w:tblGrid>
       <w:tr>
+        <w:trPr>
+          <w:cantSplit/>
+        </w:trPr>
         <w:tc>
           <w:tcPr>
             <w:tcW w:type="dxa" w:w="5800"/>
@@ -5309,12 +5424,15 @@
                 <w:sz w:val="22"/>
                 <w:szCs w:val="22"/>
               </w:rPr>
-              <w:t xml:space="preserve">Permit</w:t>
+              <w:t>Permit / action</w:t>
             </w:r>
           </w:p>
         </w:tc>
       </w:tr>
       <w:tr>
+        <w:trPr>
+          <w:cantSplit/>
+        </w:trPr>
         <w:tc>
           <w:tcPr>
             <w:tcW w:type="dxa" w:w="5800"/>
@@ -5469,6 +5587,9 @@
         </w:tc>
       </w:tr>
       <w:tr>
+        <w:trPr>
+          <w:cantSplit/>
+        </w:trPr>
         <w:tc>
           <w:tcPr>
             <w:tcW w:type="dxa" w:w="5800"/>
@@ -5503,7 +5624,7 @@
                 <w:sz w:val="22"/>
                 <w:szCs w:val="22"/>
               </w:rPr>
-              <w:t xml:space="preserve">Work where anyone could fall (roof, ladder, scaffold, platform, edge)</w:t>
+              <w:t>Fall risk (roof, ladder, scaffold, platform, edge)</w:t>
             </w:r>
           </w:p>
         </w:tc>
@@ -5623,6 +5744,9 @@
         </w:tc>
       </w:tr>
       <w:tr>
+        <w:trPr>
+          <w:cantSplit/>
+        </w:trPr>
         <w:tc>
           <w:tcPr>
             <w:tcW w:type="dxa" w:w="5800"/>
@@ -5777,6 +5901,9 @@
         </w:tc>
       </w:tr>
       <w:tr>
+        <w:trPr>
+          <w:cantSplit/>
+        </w:trPr>
         <w:tc>
           <w:tcPr>
             <w:tcW w:type="dxa" w:w="5800"/>
@@ -5811,7 +5938,7 @@
                 <w:sz w:val="22"/>
                 <w:szCs w:val="22"/>
               </w:rPr>
-              <w:t xml:space="preserve">Isolating any energy source (electrical, mechanical, hydraulic, pneumatic, thermal)</w:t>
+              <w:t>Energy isolation: electrical, mechanical, hydraulic, pneumatic, thermal</w:t>
             </w:r>
           </w:p>
         </w:tc>
@@ -5931,6 +6058,9 @@
         </w:tc>
       </w:tr>
       <w:tr>
+        <w:trPr>
+          <w:cantSplit/>
+        </w:trPr>
         <w:tc>
           <w:tcPr>
             <w:tcW w:type="dxa" w:w="5800"/>
@@ -6066,25 +6196,28 @@
           <w:p>
             <w:pPr>
               <w:spacing w:after="0" w:before="0"/>
-              <w:jc w:val="center"/>
-            </w:pPr>
-            <w:r>
-              <w:rPr>
-                <w:rFonts w:ascii="Arial" w:cs="Arial" w:eastAsia="Arial" w:hAnsi="Arial"/>
-                <w:b/>
+              <w:jc w:val="left"/>
+            </w:pPr>
+            <w:r>
+              <w:rPr>
+                <w:rFonts w:ascii="Arial" w:cs="Arial" w:eastAsia="Arial" w:hAnsi="Arial"/>
+                <w:b w:val="0"/>
                 <w:bCs/>
                 <w:i w:val="false"/>
                 <w:iCs w:val="false"/>
-                <w:color w:val="D4652B"/>
-                <w:sz w:val="22"/>
-                <w:szCs w:val="22"/>
-              </w:rPr>
-              <w:t xml:space="preserve">→ See SDS</w:t>
+                <w:color w:val="000000"/>
+                <w:sz w:val="22"/>
+                <w:szCs w:val="22"/>
+              </w:rPr>
+              <w:t>Assess hazards; check SDS. Suspected asbestos: stop and obtain specialist assessment.</w:t>
             </w:r>
           </w:p>
         </w:tc>
       </w:tr>
       <w:tr>
+        <w:trPr>
+          <w:cantSplit/>
+        </w:trPr>
         <w:tc>
           <w:tcPr>
             <w:tcW w:type="dxa" w:w="5800"/>
@@ -6241,7 +6374,7 @@
     </w:tbl>
     <w:p>
       <w:pPr>
-        <w:spacing w:after="40" w:before="140"/>
+        <w:spacing w:after="40" w:before="80"/>
       </w:pPr>
       <w:r>
         <w:rPr>
@@ -6272,7 +6405,7 @@
           <w:sz w:val="20"/>
           <w:szCs w:val="20"/>
         </w:rPr>
-        <w:t xml:space="preserve">For each work step: what can go wrong and how do we prevent it?</w:t>
+        <w:t>For each work step, identify what could go wrong and how to prevent it.</w:t>
       </w:r>
     </w:p>
     <w:tbl>
@@ -6295,6 +6428,9 @@
         <w:gridCol w:w="1866"/>
       </w:tblGrid>
       <w:tr>
+        <w:trPr>
+          <w:cantSplit/>
+        </w:trPr>
         <w:tc>
           <w:tcPr>
             <w:tcW w:type="dxa" w:w="600"/>
@@ -6408,7 +6544,7 @@
                 <w:sz w:val="22"/>
                 <w:szCs w:val="22"/>
               </w:rPr>
-              <w:t xml:space="preserve">Hazard — what could go wrong?</w:t>
+              <w:t>Hazard: what could go wrong?</w:t>
             </w:r>
           </w:p>
         </w:tc>
@@ -6447,7 +6583,7 @@
                 <w:sz w:val="22"/>
                 <w:szCs w:val="22"/>
               </w:rPr>
-              <w:t xml:space="preserve">Control — how do we prevent it?</w:t>
+              <w:t>Control: how do we prevent it?</w:t>
             </w:r>
           </w:p>
         </w:tc>
@@ -6494,6 +6630,7 @@
       <w:tr>
         <w:trPr>
           <w:trHeight w:val="360" w:hRule="atLeast"/>
+          <w:cantSplit/>
         </w:trPr>
         <w:tc>
           <w:tcPr>
@@ -6689,6 +6826,7 @@
       <w:tr>
         <w:trPr>
           <w:trHeight w:val="360" w:hRule="atLeast"/>
+          <w:cantSplit/>
         </w:trPr>
         <w:tc>
           <w:tcPr>
@@ -6884,6 +7022,7 @@
       <w:tr>
         <w:trPr>
           <w:trHeight w:val="360" w:hRule="atLeast"/>
+          <w:cantSplit/>
         </w:trPr>
         <w:tc>
           <w:tcPr>
@@ -7079,6 +7218,7 @@
       <w:tr>
         <w:trPr>
           <w:trHeight w:val="360" w:hRule="atLeast"/>
+          <w:cantSplit/>
         </w:trPr>
         <w:tc>
           <w:tcPr>
@@ -7274,6 +7414,7 @@
       <w:tr>
         <w:trPr>
           <w:trHeight w:val="360" w:hRule="atLeast"/>
+          <w:cantSplit/>
         </w:trPr>
         <w:tc>
           <w:tcPr>
@@ -7469,7 +7610,7 @@
     </w:tbl>
     <w:p>
       <w:pPr>
-        <w:spacing w:after="40" w:before="140"/>
+        <w:spacing w:after="40" w:before="80"/>
       </w:pPr>
       <w:r>
         <w:rPr>
@@ -7504,6 +7645,9 @@
         <w:gridCol w:w="2618"/>
       </w:tblGrid>
       <w:tr>
+        <w:trPr>
+          <w:cantSplit/>
+        </w:trPr>
         <w:tc>
           <w:tcPr>
             <w:tcW w:type="dxa" w:w="2616"/>
@@ -7706,6 +7850,9 @@
         </w:tc>
       </w:tr>
       <w:tr>
+        <w:trPr>
+          <w:cantSplit/>
+        </w:trPr>
         <w:tc>
           <w:tcPr>
             <w:tcW w:type="dxa" w:w="2616"/>
@@ -7909,12 +8056,18 @@
       </w:tr>
     </w:tbl>
     <w:p>
+      <w:pPr>
+        <w:spacing w:before="0" w:after="0" w:line="20" w:lineRule="exact"/>
+      </w:pPr>
       <w:r>
-        <w:br w:type="page"/>
+        <w:rPr>
+          <w:sz w:val="2"/>
+        </w:rPr>
       </w:r>
     </w:p>
     <w:p>
       <w:pPr>
+        <w:pageBreakBefore/>
         <w:spacing w:after="0" w:before="0"/>
         <w:jc w:val="center"/>
       </w:pPr>
@@ -7929,7 +8082,7 @@
           <w:sz w:val="32"/>
           <w:szCs w:val="32"/>
         </w:rPr>
-        <w:t xml:space="preserve">GENERAL PERMIT TO WORK — continued</w:t>
+        <w:t>GENERAL PERMIT TO WORK CONTINUED</w:t>
       </w:r>
     </w:p>
     <w:p>
@@ -7993,6 +8146,7 @@
       <w:tr>
         <w:trPr>
           <w:trHeight w:val="380" w:hRule="atLeast"/>
+          <w:cantSplit/>
         </w:trPr>
         <w:tc>
           <w:tcPr>
@@ -8075,6 +8229,7 @@
       <w:tr>
         <w:trPr>
           <w:trHeight w:val="380" w:hRule="atLeast"/>
+          <w:cantSplit/>
         </w:trPr>
         <w:tc>
           <w:tcPr>
@@ -8157,6 +8312,7 @@
       <w:tr>
         <w:trPr>
           <w:trHeight w:val="380" w:hRule="atLeast"/>
+          <w:cantSplit/>
         </w:trPr>
         <w:tc>
           <w:tcPr>
@@ -8237,6 +8393,9 @@
         </w:tc>
       </w:tr>
       <w:tr>
+        <w:trPr>
+          <w:cantSplit/>
+        </w:trPr>
         <w:tc>
           <w:tcPr>
             <w:tcW w:type="dxa" w:w="3600"/>
@@ -8354,6 +8513,7 @@
       <w:tr>
         <w:trPr>
           <w:trHeight w:val="480" w:hRule="atLeast"/>
+          <w:cantSplit/>
         </w:trPr>
         <w:tc>
           <w:tcPr>
@@ -8474,6 +8634,7 @@
       <w:tr>
         <w:trPr>
           <w:trHeight w:val="480" w:hRule="atLeast"/>
+          <w:cantSplit/>
         </w:trPr>
         <w:tc>
           <w:tcPr>
@@ -8607,7 +8768,7 @@
           <w:sz w:val="26"/>
           <w:szCs w:val="26"/>
         </w:rPr>
-        <w:t xml:space="preserve">TEAM BRIEFING — I have read and understood this permit and its controls</w:t>
+        <w:t>TEAM BRIEFING: I have read and understood this permit and its controls</w:t>
       </w:r>
     </w:p>
     <w:tbl>
@@ -8629,6 +8790,9 @@
         <w:gridCol w:w="1866"/>
       </w:tblGrid>
       <w:tr>
+        <w:trPr>
+          <w:cantSplit/>
+        </w:trPr>
         <w:tc>
           <w:tcPr>
             <w:tcW w:type="dxa" w:w="3600"/>
@@ -8789,6 +8953,7 @@
       <w:tr>
         <w:trPr>
           <w:trHeight w:val="360" w:hRule="atLeast"/>
+          <w:cantSplit/>
         </w:trPr>
         <w:tc>
           <w:tcPr>
@@ -8946,6 +9111,7 @@
       <w:tr>
         <w:trPr>
           <w:trHeight w:val="360" w:hRule="atLeast"/>
+          <w:cantSplit/>
         </w:trPr>
         <w:tc>
           <w:tcPr>
@@ -9103,6 +9269,7 @@
       <w:tr>
         <w:trPr>
           <w:trHeight w:val="360" w:hRule="atLeast"/>
+          <w:cantSplit/>
         </w:trPr>
         <w:tc>
           <w:tcPr>
@@ -9260,6 +9427,7 @@
       <w:tr>
         <w:trPr>
           <w:trHeight w:val="360" w:hRule="atLeast"/>
+          <w:cantSplit/>
         </w:trPr>
         <w:tc>
           <w:tcPr>
@@ -9417,6 +9585,7 @@
       <w:tr>
         <w:trPr>
           <w:trHeight w:val="360" w:hRule="atLeast"/>
+          <w:cantSplit/>
         </w:trPr>
         <w:tc>
           <w:tcPr>
@@ -9607,9 +9776,13 @@
         <w:gridCol w:w="1453"/>
         <w:gridCol w:w="1453"/>
         <w:gridCol w:w="1453"/>
+        <w:gridCol w:w="1453"/>
         <w:gridCol w:w="1454"/>
       </w:tblGrid>
       <w:tr>
+        <w:trPr>
+          <w:cantSplit/>
+        </w:trPr>
         <w:tc>
           <w:tcPr>
             <w:tcW w:type="dxa" w:w="3200"/>
@@ -9846,6 +10019,9 @@
         </w:tc>
       </w:tr>
       <w:tr>
+        <w:trPr>
+          <w:cantSplit/>
+        </w:trPr>
         <w:tc>
           <w:tcPr>
             <w:tcW w:type="dxa" w:w="3200"/>
@@ -10077,6 +10253,9 @@
         </w:tc>
       </w:tr>
       <w:tr>
+        <w:trPr>
+          <w:cantSplit/>
+        </w:trPr>
         <w:tc>
           <w:tcPr>
             <w:tcW w:type="dxa" w:w="3200"/>
@@ -10308,6 +10487,9 @@
         </w:tc>
       </w:tr>
       <w:tr>
+        <w:trPr>
+          <w:cantSplit/>
+        </w:trPr>
         <w:tc>
           <w:tcPr>
             <w:tcW w:type="dxa" w:w="3200"/>
@@ -10539,6 +10721,9 @@
         </w:tc>
       </w:tr>
       <w:tr>
+        <w:trPr>
+          <w:cantSplit/>
+        </w:trPr>
         <w:tc>
           <w:tcPr>
             <w:tcW w:type="dxa" w:w="3200"/>
@@ -10805,6 +10990,9 @@
         <w:gridCol w:w="7266"/>
       </w:tblGrid>
       <w:tr>
+        <w:trPr>
+          <w:cantSplit/>
+        </w:trPr>
         <w:tc>
           <w:tcPr>
             <w:tcW w:type="dxa" w:w="3200"/>
@@ -10884,6 +11072,9 @@
         </w:tc>
       </w:tr>
       <w:tr>
+        <w:trPr>
+          <w:cantSplit/>
+        </w:trPr>
         <w:tc>
           <w:tcPr>
             <w:tcW w:type="dxa" w:w="3200"/>
@@ -10963,6 +11154,9 @@
         </w:tc>
       </w:tr>
       <w:tr>
+        <w:trPr>
+          <w:cantSplit/>
+        </w:trPr>
         <w:tc>
           <w:tcPr>
             <w:tcW w:type="dxa" w:w="3200"/>
@@ -11042,6 +11236,9 @@
         </w:tc>
       </w:tr>
       <w:tr>
+        <w:trPr>
+          <w:cantSplit/>
+        </w:trPr>
         <w:tc>
           <w:tcPr>
             <w:tcW w:type="dxa" w:w="3200"/>
@@ -11123,6 +11320,7 @@
       <w:tr>
         <w:trPr>
           <w:trHeight w:val="400" w:hRule="atLeast"/>
+          <w:cantSplit/>
         </w:trPr>
         <w:tc>
           <w:tcPr>
@@ -11205,6 +11403,7 @@
       <w:tr>
         <w:trPr>
           <w:trHeight w:val="400" w:hRule="atLeast"/>
+          <w:cantSplit/>
         </w:trPr>
         <w:tc>
           <w:tcPr>
@@ -11352,6 +11551,9 @@
         <w:gridCol w:w="2466"/>
       </w:tblGrid>
       <w:tr>
+        <w:trPr>
+          <w:cantSplit/>
+        </w:trPr>
         <w:tc>
           <w:tcPr>
             <w:tcW w:type="dxa" w:w="2600"/>
@@ -11526,6 +11728,9 @@
         <w:gridCol w:w="1866"/>
       </w:tblGrid>
       <w:tr>
+        <w:trPr>
+          <w:cantSplit/>
+        </w:trPr>
         <w:tc>
           <w:tcPr>
             <w:tcW w:type="dxa" w:w="7600"/>
@@ -11647,6 +11852,7 @@
       <w:tr>
         <w:trPr>
           <w:trHeight w:val="360" w:hRule="atLeast"/>
+          <w:cantSplit/>
         </w:trPr>
         <w:tc>
           <w:tcPr>
@@ -11682,7 +11888,7 @@
                 <w:sz w:val="22"/>
                 <w:szCs w:val="22"/>
               </w:rPr>
-              <w:t xml:space="preserve">Combustible materials removed or covered (min. 10m radius)</w:t>
+              <w:t>Combustible materials removed or covered (minimum 10 m radius)</w:t>
             </w:r>
           </w:p>
         </w:tc>
@@ -11766,6 +11972,7 @@
       <w:tr>
         <w:trPr>
           <w:trHeight w:val="360" w:hRule="atLeast"/>
+          <w:cantSplit/>
         </w:trPr>
         <w:tc>
           <w:tcPr>
@@ -11885,6 +12092,7 @@
       <w:tr>
         <w:trPr>
           <w:trHeight w:val="360" w:hRule="atLeast"/>
+          <w:cantSplit/>
         </w:trPr>
         <w:tc>
           <w:tcPr>
@@ -12004,6 +12212,7 @@
       <w:tr>
         <w:trPr>
           <w:trHeight w:val="360" w:hRule="atLeast"/>
+          <w:cantSplit/>
         </w:trPr>
         <w:tc>
           <w:tcPr>
@@ -12123,6 +12332,7 @@
       <w:tr>
         <w:trPr>
           <w:trHeight w:val="360" w:hRule="atLeast"/>
+          <w:cantSplit/>
         </w:trPr>
         <w:tc>
           <w:tcPr>
@@ -12242,6 +12452,7 @@
       <w:tr>
         <w:trPr>
           <w:trHeight w:val="360" w:hRule="atLeast"/>
+          <w:cantSplit/>
         </w:trPr>
         <w:tc>
           <w:tcPr>
@@ -12277,7 +12488,7 @@
                 <w:sz w:val="22"/>
                 <w:szCs w:val="22"/>
               </w:rPr>
-              <w:t xml:space="preserve">Fire extinguishers of correct type at work site (min. 2)</w:t>
+              <w:t>Fire extinguishers of the correct type at the work site (minimum 2)</w:t>
             </w:r>
           </w:p>
         </w:tc>
@@ -12361,6 +12572,7 @@
       <w:tr>
         <w:trPr>
           <w:trHeight w:val="360" w:hRule="atLeast"/>
+          <w:cantSplit/>
         </w:trPr>
         <w:tc>
           <w:tcPr>
@@ -12396,7 +12608,7 @@
                 <w:sz w:val="22"/>
                 <w:szCs w:val="22"/>
               </w:rPr>
-              <w:t xml:space="preserve">Fire detection / suppression isolated? If yes — area noted for reactivation</w:t>
+              <w:t>Fire detection / suppression isolated? If yes, record the area for reactivation</w:t>
             </w:r>
           </w:p>
         </w:tc>
@@ -12480,6 +12692,7 @@
       <w:tr>
         <w:trPr>
           <w:trHeight w:val="360" w:hRule="atLeast"/>
+          <w:cantSplit/>
         </w:trPr>
         <w:tc>
           <w:tcPr>
@@ -12599,6 +12812,7 @@
       <w:tr>
         <w:trPr>
           <w:trHeight w:val="360" w:hRule="atLeast"/>
+          <w:cantSplit/>
         </w:trPr>
         <w:tc>
           <w:tcPr>
@@ -12718,6 +12932,7 @@
       <w:tr>
         <w:trPr>
           <w:trHeight w:val="360" w:hRule="atLeast"/>
+          <w:cantSplit/>
         </w:trPr>
         <w:tc>
           <w:tcPr>
@@ -12837,6 +13052,7 @@
       <w:tr>
         <w:trPr>
           <w:trHeight w:val="360" w:hRule="atLeast"/>
+          <w:cantSplit/>
         </w:trPr>
         <w:tc>
           <w:tcPr>
@@ -12872,7 +13088,7 @@
                 <w:sz w:val="22"/>
                 <w:szCs w:val="22"/>
               </w:rPr>
-              <w:t xml:space="preserve">Fire Watch person assigned by name: ____________________</w:t>
+              <w:t>Fire Watch assigned by name: ____________________</w:t>
             </w:r>
           </w:p>
         </w:tc>
@@ -12956,6 +13172,7 @@
       <w:tr>
         <w:trPr>
           <w:trHeight w:val="360" w:hRule="atLeast"/>
+          <w:cantSplit/>
         </w:trPr>
         <w:tc>
           <w:tcPr>
@@ -13075,6 +13292,7 @@
       <w:tr>
         <w:trPr>
           <w:trHeight w:val="360" w:hRule="atLeast"/>
+          <w:cantSplit/>
         </w:trPr>
         <w:tc>
           <w:tcPr>
@@ -13110,7 +13328,7 @@
                 <w:sz w:val="22"/>
                 <w:szCs w:val="22"/>
               </w:rPr>
-              <w:t xml:space="preserve">PPE appropriate (welding jacket, gloves, goggles etc.)</w:t>
+              <w:t>PPE appropriate (welding jacket, gloves, goggles etc.)</w:t>
             </w:r>
           </w:p>
         </w:tc>
@@ -13194,6 +13412,7 @@
       <w:tr>
         <w:trPr>
           <w:trHeight w:val="360" w:hRule="atLeast"/>
+          <w:cantSplit/>
         </w:trPr>
         <w:tc>
           <w:tcPr>
@@ -13347,6 +13566,7 @@
       <w:tr>
         <w:trPr>
           <w:trHeight w:val="700" w:hRule="atLeast"/>
+          <w:cantSplit/>
         </w:trPr>
         <w:tc>
           <w:tcPr>
@@ -13425,6 +13645,7 @@
       <w:tr>
         <w:trPr>
           <w:trHeight w:val="380" w:hRule="atLeast"/>
+          <w:cantSplit/>
         </w:trPr>
         <w:tc>
           <w:tcPr>
@@ -13507,6 +13728,7 @@
       <w:tr>
         <w:trPr>
           <w:trHeight w:val="380" w:hRule="atLeast"/>
+          <w:cantSplit/>
         </w:trPr>
         <w:tc>
           <w:tcPr>
@@ -13589,6 +13811,7 @@
       <w:tr>
         <w:trPr>
           <w:trHeight w:val="380" w:hRule="atLeast"/>
+          <w:cantSplit/>
         </w:trPr>
         <w:tc>
           <w:tcPr>
@@ -13671,6 +13894,7 @@
       <w:tr>
         <w:trPr>
           <w:trHeight w:val="380" w:hRule="atLeast"/>
+          <w:cantSplit/>
         </w:trPr>
         <w:tc>
           <w:tcPr>
@@ -13753,6 +13977,7 @@
       <w:tr>
         <w:trPr>
           <w:trHeight w:val="420" w:hRule="atLeast"/>
+          <w:cantSplit/>
         </w:trPr>
         <w:tc>
           <w:tcPr>
@@ -13789,7 +14014,7 @@
                 <w:sz w:val="22"/>
                 <w:szCs w:val="22"/>
               </w:rPr>
-              <w:t xml:space="preserve">Fire Watch — name &amp; signature</w:t>
+              <w:t>Fire Watch: name and signature</w:t>
             </w:r>
           </w:p>
         </w:tc>
@@ -13835,6 +14060,7 @@
       <w:tr>
         <w:trPr>
           <w:trHeight w:val="420" w:hRule="atLeast"/>
+          <w:cantSplit/>
         </w:trPr>
         <w:tc>
           <w:tcPr>
@@ -13982,6 +14208,9 @@
         <w:gridCol w:w="2466"/>
       </w:tblGrid>
       <w:tr>
+        <w:trPr>
+          <w:cantSplit/>
+        </w:trPr>
         <w:tc>
           <w:tcPr>
             <w:tcW w:type="dxa" w:w="2600"/>
@@ -14156,6 +14385,9 @@
         <w:gridCol w:w="1866"/>
       </w:tblGrid>
       <w:tr>
+        <w:trPr>
+          <w:cantSplit/>
+        </w:trPr>
         <w:tc>
           <w:tcPr>
             <w:tcW w:type="dxa" w:w="7600"/>
@@ -14191,7 +14423,7 @@
                 <w:sz w:val="22"/>
                 <w:szCs w:val="22"/>
               </w:rPr>
-              <w:t xml:space="preserve">PLAN — before work begins (hierarchy: eliminate → collective → personal protection)</w:t>
+              <w:t>PLAN before work begins (eliminate the hazard → collective protection → personal protection)</w:t>
             </w:r>
           </w:p>
         </w:tc>
@@ -14277,6 +14509,7 @@
       <w:tr>
         <w:trPr>
           <w:trHeight w:val="360" w:hRule="atLeast"/>
+          <w:cantSplit/>
         </w:trPr>
         <w:tc>
           <w:tcPr>
@@ -14396,6 +14629,7 @@
       <w:tr>
         <w:trPr>
           <w:trHeight w:val="360" w:hRule="atLeast"/>
+          <w:cantSplit/>
         </w:trPr>
         <w:tc>
           <w:tcPr>
@@ -14515,6 +14749,7 @@
       <w:tr>
         <w:trPr>
           <w:trHeight w:val="360" w:hRule="atLeast"/>
+          <w:cantSplit/>
         </w:trPr>
         <w:tc>
           <w:tcPr>
@@ -14550,7 +14785,7 @@
                 <w:sz w:val="22"/>
                 <w:szCs w:val="22"/>
               </w:rPr>
-              <w:t xml:space="preserve">Only if collective protection not feasible: PSAgA (personal fall arrest) planned?</w:t>
+              <w:t>If collective protection is not feasible: personal fall protection equipment (PFPE) planned?</w:t>
             </w:r>
           </w:p>
         </w:tc>
@@ -14634,6 +14869,7 @@
       <w:tr>
         <w:trPr>
           <w:trHeight w:val="360" w:hRule="atLeast"/>
+          <w:cantSplit/>
         </w:trPr>
         <w:tc>
           <w:tcPr>
@@ -14669,7 +14905,7 @@
                 <w:sz w:val="22"/>
                 <w:szCs w:val="22"/>
               </w:rPr>
-              <w:t xml:space="preserve">PSAgA users hold documented training (min. 1 day, SUVA requirement)?</w:t>
+              <w:t>PFPE users have documented training (minimum 1 day, Suva requirement)?</w:t>
             </w:r>
           </w:p>
         </w:tc>
@@ -14753,6 +14989,7 @@
       <w:tr>
         <w:trPr>
           <w:trHeight w:val="360" w:hRule="atLeast"/>
+          <w:cantSplit/>
         </w:trPr>
         <w:tc>
           <w:tcPr>
@@ -14872,6 +15109,7 @@
       <w:tr>
         <w:trPr>
           <w:trHeight w:val="360" w:hRule="atLeast"/>
+          <w:cantSplit/>
         </w:trPr>
         <w:tc>
           <w:tcPr>
@@ -14991,6 +15229,7 @@
       <w:tr>
         <w:trPr>
           <w:trHeight w:val="360" w:hRule="atLeast"/>
+          <w:cantSplit/>
         </w:trPr>
         <w:tc>
           <w:tcPr>
@@ -15026,7 +15265,7 @@
                 <w:sz w:val="22"/>
                 <w:szCs w:val="22"/>
               </w:rPr>
-              <w:t xml:space="preserve">Fall height assessed? (BauAV: measures required from 2m)</w:t>
+              <w:t>Fall height assessed? (BauAV: measures required from 2 m)</w:t>
             </w:r>
           </w:p>
         </w:tc>
@@ -15126,6 +15365,9 @@
         <w:gridCol w:w="1866"/>
       </w:tblGrid>
       <w:tr>
+        <w:trPr>
+          <w:cantSplit/>
+        </w:trPr>
         <w:tc>
           <w:tcPr>
             <w:tcW w:type="dxa" w:w="7600"/>
@@ -15161,7 +15403,7 @@
                 <w:sz w:val="22"/>
                 <w:szCs w:val="22"/>
               </w:rPr>
-              <w:t xml:space="preserve">DO — before and during work</w:t>
+              <w:t>CHECK before and during work</w:t>
             </w:r>
           </w:p>
         </w:tc>
@@ -15247,6 +15489,7 @@
       <w:tr>
         <w:trPr>
           <w:trHeight w:val="360" w:hRule="atLeast"/>
+          <w:cantSplit/>
         </w:trPr>
         <w:tc>
           <w:tcPr>
@@ -15282,7 +15525,7 @@
                 <w:sz w:val="22"/>
                 <w:szCs w:val="22"/>
               </w:rPr>
-              <w:t xml:space="preserve">Exclusion zone established below (barriers, signage) — falling objects</w:t>
+              <w:t>Exclusion zone established below to protect against falling objects (barriers, signs)</w:t>
             </w:r>
           </w:p>
         </w:tc>
@@ -15366,6 +15609,7 @@
       <w:tr>
         <w:trPr>
           <w:trHeight w:val="360" w:hRule="atLeast"/>
+          <w:cantSplit/>
         </w:trPr>
         <w:tc>
           <w:tcPr>
@@ -15485,6 +15729,7 @@
       <w:tr>
         <w:trPr>
           <w:trHeight w:val="360" w:hRule="atLeast"/>
+          <w:cantSplit/>
         </w:trPr>
         <w:tc>
           <w:tcPr>
@@ -15604,6 +15849,7 @@
       <w:tr>
         <w:trPr>
           <w:trHeight w:val="360" w:hRule="atLeast"/>
+          <w:cantSplit/>
         </w:trPr>
         <w:tc>
           <w:tcPr>
@@ -15723,6 +15969,7 @@
       <w:tr>
         <w:trPr>
           <w:trHeight w:val="360" w:hRule="atLeast"/>
+          <w:cantSplit/>
         </w:trPr>
         <w:tc>
           <w:tcPr>
@@ -15758,7 +16005,7 @@
                 <w:sz w:val="22"/>
                 <w:szCs w:val="22"/>
               </w:rPr>
-              <w:t xml:space="preserve">Ladder: last resort only — secured, 4:1 angle, 1m above step-off (if applicable)</w:t>
+              <w:t>Ladder: last resort, secured, set at 4:1, extending 1 m above the step-off point (if applicable)</w:t>
             </w:r>
           </w:p>
         </w:tc>
@@ -15842,6 +16089,7 @@
       <w:tr>
         <w:trPr>
           <w:trHeight w:val="360" w:hRule="atLeast"/>
+          <w:cantSplit/>
         </w:trPr>
         <w:tc>
           <w:tcPr>
@@ -15877,7 +16125,7 @@
                 <w:sz w:val="22"/>
                 <w:szCs w:val="22"/>
               </w:rPr>
-              <w:t xml:space="preserve">PSAgA: harness inspected, lanyard length correct for fall distance, shock absorber</w:t>
+              <w:t>PFPE: harness inspected, lanyard length matched to fall distance, energy absorber</w:t>
             </w:r>
           </w:p>
         </w:tc>
@@ -15961,6 +16209,7 @@
       <w:tr>
         <w:trPr>
           <w:trHeight w:val="360" w:hRule="atLeast"/>
+          <w:cantSplit/>
         </w:trPr>
         <w:tc>
           <w:tcPr>
@@ -15996,7 +16245,7 @@
                 <w:sz w:val="22"/>
                 <w:szCs w:val="22"/>
               </w:rPr>
-              <w:t xml:space="preserve">Tools and materials secured against falling (lanyards, containers, kick boards)</w:t>
+              <w:t>Tools and materials secured against falling (lanyards, containers, toe boards)</w:t>
             </w:r>
           </w:p>
         </w:tc>
@@ -16080,6 +16329,7 @@
       <w:tr>
         <w:trPr>
           <w:trHeight w:val="360" w:hRule="atLeast"/>
+          <w:cantSplit/>
         </w:trPr>
         <w:tc>
           <w:tcPr>
@@ -16199,6 +16449,7 @@
       <w:tr>
         <w:trPr>
           <w:trHeight w:val="360" w:hRule="atLeast"/>
+          <w:cantSplit/>
         </w:trPr>
         <w:tc>
           <w:tcPr>
@@ -16353,6 +16604,7 @@
       <w:tr>
         <w:trPr>
           <w:trHeight w:val="440" w:hRule="atLeast"/>
+          <w:cantSplit/>
         </w:trPr>
         <w:tc>
           <w:tcPr>
@@ -16435,6 +16687,7 @@
       <w:tr>
         <w:trPr>
           <w:trHeight w:val="440" w:hRule="atLeast"/>
+          <w:cantSplit/>
         </w:trPr>
         <w:tc>
           <w:tcPr>
@@ -16517,6 +16770,7 @@
       <w:tr>
         <w:trPr>
           <w:trHeight w:val="380" w:hRule="atLeast"/>
+          <w:cantSplit/>
         </w:trPr>
         <w:tc>
           <w:tcPr>
@@ -16634,6 +16888,7 @@
       <w:tr>
         <w:trPr>
           <w:trHeight w:val="420" w:hRule="atLeast"/>
+          <w:cantSplit/>
         </w:trPr>
         <w:tc>
           <w:tcPr>
@@ -16670,7 +16925,7 @@
                 <w:sz w:val="22"/>
                 <w:szCs w:val="22"/>
               </w:rPr>
-              <w:t xml:space="preserve">Responsible Person — name &amp; signature</w:t>
+              <w:t>Responsible Person: name and signature</w:t>
             </w:r>
           </w:p>
         </w:tc>
@@ -16716,6 +16971,7 @@
       <w:tr>
         <w:trPr>
           <w:trHeight w:val="420" w:hRule="atLeast"/>
+          <w:cantSplit/>
         </w:trPr>
         <w:tc>
           <w:tcPr>
@@ -16752,7 +17008,7 @@
                 <w:sz w:val="22"/>
                 <w:szCs w:val="22"/>
               </w:rPr>
-              <w:t xml:space="preserve">Work Leader — name &amp; signature</w:t>
+              <w:t>Work Leader: name and signature</w:t>
             </w:r>
           </w:p>
         </w:tc>
@@ -16863,6 +17119,9 @@
         <w:gridCol w:w="2466"/>
       </w:tblGrid>
       <w:tr>
+        <w:trPr>
+          <w:cantSplit/>
+        </w:trPr>
         <w:tc>
           <w:tcPr>
             <w:tcW w:type="dxa" w:w="2600"/>
@@ -17037,6 +17296,9 @@
         <w:gridCol w:w="1866"/>
       </w:tblGrid>
       <w:tr>
+        <w:trPr>
+          <w:cantSplit/>
+        </w:trPr>
         <w:tc>
           <w:tcPr>
             <w:tcW w:type="dxa" w:w="7600"/>
@@ -17072,7 +17334,7 @@
                 <w:sz w:val="22"/>
                 <w:szCs w:val="22"/>
               </w:rPr>
-              <w:t xml:space="preserve">PLAN — before entry (SUVA: ventilate → measure → monitor → supervise)</w:t>
+              <w:t>PLAN before entry (Suva: ventilate → measure → monitor → supervise)</w:t>
             </w:r>
           </w:p>
         </w:tc>
@@ -17158,6 +17420,7 @@
       <w:tr>
         <w:trPr>
           <w:trHeight w:val="360" w:hRule="atLeast"/>
+          <w:cantSplit/>
         </w:trPr>
         <w:tc>
           <w:tcPr>
@@ -17277,6 +17540,7 @@
       <w:tr>
         <w:trPr>
           <w:trHeight w:val="360" w:hRule="atLeast"/>
+          <w:cantSplit/>
         </w:trPr>
         <w:tc>
           <w:tcPr>
@@ -17396,6 +17660,7 @@
       <w:tr>
         <w:trPr>
           <w:trHeight w:val="360" w:hRule="atLeast"/>
+          <w:cantSplit/>
         </w:trPr>
         <w:tc>
           <w:tcPr>
@@ -17515,6 +17780,7 @@
       <w:tr>
         <w:trPr>
           <w:trHeight w:val="360" w:hRule="atLeast"/>
+          <w:cantSplit/>
         </w:trPr>
         <w:tc>
           <w:tcPr>
@@ -17634,6 +17900,7 @@
       <w:tr>
         <w:trPr>
           <w:trHeight w:val="360" w:hRule="atLeast"/>
+          <w:cantSplit/>
         </w:trPr>
         <w:tc>
           <w:tcPr>
@@ -17753,6 +18020,7 @@
       <w:tr>
         <w:trPr>
           <w:trHeight w:val="360" w:hRule="atLeast"/>
+          <w:cantSplit/>
         </w:trPr>
         <w:tc>
           <w:tcPr>
@@ -17788,7 +18056,7 @@
                 <w:sz w:val="22"/>
                 <w:szCs w:val="22"/>
               </w:rPr>
-              <w:t xml:space="preserve">Atmosphere tested and within safe limits — see readings below</w:t>
+              <w:t>Atmosphere tested and within safe limits (record readings below)</w:t>
             </w:r>
           </w:p>
         </w:tc>
@@ -17872,6 +18140,7 @@
       <w:tr>
         <w:trPr>
           <w:trHeight w:val="360" w:hRule="atLeast"/>
+          <w:cantSplit/>
         </w:trPr>
         <w:tc>
           <w:tcPr>
@@ -17991,6 +18260,7 @@
       <w:tr>
         <w:trPr>
           <w:trHeight w:val="360" w:hRule="atLeast"/>
+          <w:cantSplit/>
         </w:trPr>
         <w:tc>
           <w:tcPr>
@@ -18110,6 +18380,7 @@
       <w:tr>
         <w:trPr>
           <w:trHeight w:val="360" w:hRule="atLeast"/>
+          <w:cantSplit/>
         </w:trPr>
         <w:tc>
           <w:tcPr>
@@ -18229,6 +18500,7 @@
       <w:tr>
         <w:trPr>
           <w:trHeight w:val="360" w:hRule="atLeast"/>
+          <w:cantSplit/>
         </w:trPr>
         <w:tc>
           <w:tcPr>
@@ -18348,6 +18620,7 @@
       <w:tr>
         <w:trPr>
           <w:trHeight w:val="360" w:hRule="atLeast"/>
+          <w:cantSplit/>
         </w:trPr>
         <w:tc>
           <w:tcPr>
@@ -18467,6 +18740,7 @@
       <w:tr>
         <w:trPr>
           <w:trHeight w:val="360" w:hRule="atLeast"/>
+          <w:cantSplit/>
         </w:trPr>
         <w:tc>
           <w:tcPr>
@@ -18586,6 +18860,7 @@
       <w:tr>
         <w:trPr>
           <w:trHeight w:val="360" w:hRule="atLeast"/>
+          <w:cantSplit/>
         </w:trPr>
         <w:tc>
           <w:tcPr>
@@ -18705,6 +18980,7 @@
       <w:tr>
         <w:trPr>
           <w:trHeight w:val="360" w:hRule="atLeast"/>
+          <w:cantSplit/>
         </w:trPr>
         <w:tc>
           <w:tcPr>
@@ -18824,6 +19100,7 @@
       <w:tr>
         <w:trPr>
           <w:trHeight w:val="360" w:hRule="atLeast"/>
+          <w:cantSplit/>
         </w:trPr>
         <w:tc>
           <w:tcPr>
@@ -18859,7 +19136,7 @@
                 <w:sz w:val="22"/>
                 <w:szCs w:val="22"/>
               </w:rPr>
-              <w:t xml:space="preserve">Hot work permit attached if applicable (0% LEL required for hot work)</w:t>
+              <w:t>Hot work permit attached if applicable (0% LEL required for hot work)</w:t>
             </w:r>
           </w:p>
         </w:tc>
@@ -18943,6 +19220,8 @@
     </w:tbl>
     <w:p>
       <w:pPr>
+        <w:keepNext/>
+        <w:pageBreakBefore/>
         <w:spacing w:after="40" w:before="140"/>
       </w:pPr>
       <w:r>
@@ -18956,7 +19235,11 @@
           <w:sz w:val="26"/>
           <w:szCs w:val="26"/>
         </w:rPr>
-        <w:t xml:space="preserve">DO — ATMOSPHERIC TEST READINGS</w:t>
+        <w:t>CONFINED SPACE ENTRY PERMIT CONTINUED</w:t>
+        <w:br/>
+        <w:t>Permit No.: __________   Date: __________</w:t>
+        <w:br/>
+        <w:t>ATMOSPHERIC TEST READINGS</w:t>
       </w:r>
     </w:p>
     <w:tbl>
@@ -18981,6 +19264,9 @@
         <w:gridCol w:w="1534"/>
       </w:tblGrid>
       <w:tr>
+        <w:trPr>
+          <w:cantSplit/>
+        </w:trPr>
         <w:tc>
           <w:tcPr>
             <w:tcW w:type="dxa" w:w="1400"/>
@@ -19258,6 +19544,7 @@
       <w:tr>
         <w:trPr>
           <w:trHeight w:val="340" w:hRule="atLeast"/>
+          <w:cantSplit/>
         </w:trPr>
         <w:tc>
           <w:tcPr>
@@ -19529,6 +19816,7 @@
       <w:tr>
         <w:trPr>
           <w:trHeight w:val="340" w:hRule="atLeast"/>
+          <w:cantSplit/>
         </w:trPr>
         <w:tc>
           <w:tcPr>
@@ -19800,6 +20088,7 @@
       <w:tr>
         <w:trPr>
           <w:trHeight w:val="340" w:hRule="atLeast"/>
+          <w:cantSplit/>
         </w:trPr>
         <w:tc>
           <w:tcPr>
@@ -20071,6 +20360,7 @@
       <w:tr>
         <w:trPr>
           <w:trHeight w:val="340" w:hRule="atLeast"/>
+          <w:cantSplit/>
         </w:trPr>
         <w:tc>
           <w:tcPr>
@@ -20342,6 +20632,7 @@
       <w:tr>
         <w:trPr>
           <w:trHeight w:val="340" w:hRule="atLeast"/>
+          <w:cantSplit/>
         </w:trPr>
         <w:tc>
           <w:tcPr>
@@ -20613,6 +20904,7 @@
       <w:tr>
         <w:trPr>
           <w:trHeight w:val="340" w:hRule="atLeast"/>
+          <w:cantSplit/>
         </w:trPr>
         <w:tc>
           <w:tcPr>
@@ -20897,7 +21189,7 @@
           <w:sz w:val="26"/>
           <w:szCs w:val="26"/>
         </w:rPr>
-        <w:t xml:space="preserve">DO — ENTRY / EXIT LOG</w:t>
+        <w:t>RECORD ENTRY AND EXIT</w:t>
       </w:r>
     </w:p>
     <w:tbl>
@@ -20919,6 +21211,9 @@
         <w:gridCol w:w="2666"/>
       </w:tblGrid>
       <w:tr>
+        <w:trPr>
+          <w:cantSplit/>
+        </w:trPr>
         <w:tc>
           <w:tcPr>
             <w:tcW w:type="dxa" w:w="3400"/>
@@ -21079,6 +21374,7 @@
       <w:tr>
         <w:trPr>
           <w:trHeight w:val="340" w:hRule="atLeast"/>
+          <w:cantSplit/>
         </w:trPr>
         <w:tc>
           <w:tcPr>
@@ -21236,6 +21532,7 @@
       <w:tr>
         <w:trPr>
           <w:trHeight w:val="340" w:hRule="atLeast"/>
+          <w:cantSplit/>
         </w:trPr>
         <w:tc>
           <w:tcPr>
@@ -21393,6 +21690,7 @@
       <w:tr>
         <w:trPr>
           <w:trHeight w:val="340" w:hRule="atLeast"/>
+          <w:cantSplit/>
         </w:trPr>
         <w:tc>
           <w:tcPr>
@@ -21550,6 +21848,7 @@
       <w:tr>
         <w:trPr>
           <w:trHeight w:val="340" w:hRule="atLeast"/>
+          <w:cantSplit/>
         </w:trPr>
         <w:tc>
           <w:tcPr>
@@ -21707,6 +22006,7 @@
       <w:tr>
         <w:trPr>
           <w:trHeight w:val="340" w:hRule="atLeast"/>
+          <w:cantSplit/>
         </w:trPr>
         <w:tc>
           <w:tcPr>
@@ -21864,6 +22164,7 @@
       <w:tr>
         <w:trPr>
           <w:trHeight w:val="340" w:hRule="atLeast"/>
+          <w:cantSplit/>
         </w:trPr>
         <w:tc>
           <w:tcPr>
@@ -22056,6 +22357,7 @@
       <w:tr>
         <w:trPr>
           <w:trHeight w:val="420" w:hRule="atLeast"/>
+          <w:cantSplit/>
         </w:trPr>
         <w:tc>
           <w:tcPr>
@@ -22092,7 +22394,7 @@
                 <w:sz w:val="22"/>
                 <w:szCs w:val="22"/>
               </w:rPr>
-              <w:t xml:space="preserve">Responsible Person — name &amp; signature</w:t>
+              <w:t>Responsible Person: name and signature</w:t>
             </w:r>
           </w:p>
         </w:tc>
@@ -22138,6 +22440,7 @@
       <w:tr>
         <w:trPr>
           <w:trHeight w:val="420" w:hRule="atLeast"/>
+          <w:cantSplit/>
         </w:trPr>
         <w:tc>
           <w:tcPr>
@@ -22174,7 +22477,7 @@
                 <w:sz w:val="22"/>
                 <w:szCs w:val="22"/>
               </w:rPr>
-              <w:t xml:space="preserve">Work Leader — name &amp; signature</w:t>
+              <w:t>Work Leader: name and signature</w:t>
             </w:r>
           </w:p>
         </w:tc>
@@ -22220,6 +22523,7 @@
       <w:tr>
         <w:trPr>
           <w:trHeight w:val="420" w:hRule="atLeast"/>
+          <w:cantSplit/>
         </w:trPr>
         <w:tc>
           <w:tcPr>
@@ -22256,7 +22560,7 @@
                 <w:sz w:val="22"/>
                 <w:szCs w:val="22"/>
               </w:rPr>
-              <w:t xml:space="preserve">Standby Person — name &amp; signature</w:t>
+              <w:t>Standby Person: name and signature</w:t>
             </w:r>
           </w:p>
         </w:tc>
@@ -22367,6 +22671,9 @@
         <w:gridCol w:w="2466"/>
       </w:tblGrid>
       <w:tr>
+        <w:trPr>
+          <w:cantSplit/>
+        </w:trPr>
         <w:tc>
           <w:tcPr>
             <w:tcW w:type="dxa" w:w="2600"/>
@@ -22538,7 +22845,7 @@
           <w:sz w:val="26"/>
           <w:szCs w:val="26"/>
         </w:rPr>
-        <w:t xml:space="preserve">PLAN — ENERGY SOURCES TO ISOLATE (identify ALL sources before starting)</w:t>
+        <w:t>PLAN ENERGY ISOLATION (identify ALL sources before starting)</w:t>
       </w:r>
     </w:p>
     <w:tbl>
@@ -22560,6 +22867,9 @@
         <w:gridCol w:w="2618"/>
       </w:tblGrid>
       <w:tr>
+        <w:trPr>
+          <w:cantSplit/>
+        </w:trPr>
         <w:tc>
           <w:tcPr>
             <w:tcW w:type="dxa" w:w="2616"/>
@@ -22762,6 +23072,9 @@
         </w:tc>
       </w:tr>
       <w:tr>
+        <w:trPr>
+          <w:cantSplit/>
+        </w:trPr>
         <w:tc>
           <w:tcPr>
             <w:tcW w:type="dxa" w:w="2616"/>
@@ -22979,7 +23292,7 @@
           <w:sz w:val="26"/>
           <w:szCs w:val="26"/>
         </w:rPr>
-        <w:t xml:space="preserve">DO — 5-STEP ISOLATION PROCEDURE (SUVA lebenswichtige Regeln)</w:t>
+        <w:t>FOLLOW THE FIVE-STEP ISOLATION PROCEDURE (Suva life-saving rules)</w:t>
       </w:r>
     </w:p>
     <w:tbl>
@@ -22999,6 +23312,9 @@
         <w:gridCol w:w="9666"/>
       </w:tblGrid>
       <w:tr>
+        <w:trPr>
+          <w:cantSplit/>
+        </w:trPr>
         <w:tc>
           <w:tcPr>
             <w:tcW w:type="dxa" w:w="800"/>
@@ -23081,6 +23397,7 @@
       <w:tr>
         <w:trPr>
           <w:trHeight w:val="360" w:hRule="atLeast"/>
+          <w:cantSplit/>
         </w:trPr>
         <w:tc>
           <w:tcPr>
@@ -23162,6 +23479,7 @@
       <w:tr>
         <w:trPr>
           <w:trHeight w:val="360" w:hRule="atLeast"/>
+          <w:cantSplit/>
         </w:trPr>
         <w:tc>
           <w:tcPr>
@@ -23243,6 +23561,7 @@
       <w:tr>
         <w:trPr>
           <w:trHeight w:val="360" w:hRule="atLeast"/>
+          <w:cantSplit/>
         </w:trPr>
         <w:tc>
           <w:tcPr>
@@ -23316,7 +23635,7 @@
                 <w:sz w:val="22"/>
                 <w:szCs w:val="22"/>
               </w:rPr>
-              <w:t xml:space="preserve">LOCK each isolation point with a personal lock + tag (every person uses their OWN lock)</w:t>
+              <w:t>ISOLATE all energy sources, then lock each isolation point with a personal lock and tag (every person uses their own lock).</w:t>
             </w:r>
           </w:p>
         </w:tc>
@@ -23324,6 +23643,7 @@
       <w:tr>
         <w:trPr>
           <w:trHeight w:val="360" w:hRule="atLeast"/>
+          <w:cantSplit/>
         </w:trPr>
         <w:tc>
           <w:tcPr>
@@ -23397,7 +23717,7 @@
                 <w:sz w:val="22"/>
                 <w:szCs w:val="22"/>
               </w:rPr>
-              <w:t xml:space="preserve">DISSIPATE stored energy — bleed pressure, lower loads, discharge capacitors, drain fluids</w:t>
+              <w:t>DISSIPATE stored energy: bleed pressure, lower loads, discharge capacitors, drain fluids</w:t>
             </w:r>
           </w:p>
         </w:tc>
@@ -23405,6 +23725,7 @@
       <w:tr>
         <w:trPr>
           <w:trHeight w:val="360" w:hRule="atLeast"/>
+          <w:cantSplit/>
         </w:trPr>
         <w:tc>
           <w:tcPr>
@@ -23478,7 +23799,7 @@
                 <w:sz w:val="22"/>
                 <w:szCs w:val="22"/>
               </w:rPr>
-              <w:t xml:space="preserve">VERIFY isolation is effective — try-start, test, measure. Only then begin work</w:t>
+              <w:t>VERIFY that isolation is effective: try-start, test and measure. Only then begin work</w:t>
             </w:r>
           </w:p>
         </w:tc>
@@ -23499,7 +23820,7 @@
           <w:sz w:val="26"/>
           <w:szCs w:val="26"/>
         </w:rPr>
-        <w:t xml:space="preserve">DO — ISOLATION REGISTER</w:t>
+        <w:t>RECORD ISOLATIONS</w:t>
       </w:r>
     </w:p>
     <w:tbl>
@@ -23523,6 +23844,9 @@
         <w:gridCol w:w="2166"/>
       </w:tblGrid>
       <w:tr>
+        <w:trPr>
+          <w:cantSplit/>
+        </w:trPr>
         <w:tc>
           <w:tcPr>
             <w:tcW w:type="dxa" w:w="2800"/>
@@ -23761,6 +24085,7 @@
       <w:tr>
         <w:trPr>
           <w:trHeight w:val="360" w:hRule="atLeast"/>
+          <w:cantSplit/>
         </w:trPr>
         <w:tc>
           <w:tcPr>
@@ -23994,6 +24319,7 @@
       <w:tr>
         <w:trPr>
           <w:trHeight w:val="360" w:hRule="atLeast"/>
+          <w:cantSplit/>
         </w:trPr>
         <w:tc>
           <w:tcPr>
@@ -24227,6 +24553,7 @@
       <w:tr>
         <w:trPr>
           <w:trHeight w:val="360" w:hRule="atLeast"/>
+          <w:cantSplit/>
         </w:trPr>
         <w:tc>
           <w:tcPr>
@@ -24460,6 +24787,7 @@
       <w:tr>
         <w:trPr>
           <w:trHeight w:val="360" w:hRule="atLeast"/>
+          <w:cantSplit/>
         </w:trPr>
         <w:tc>
           <w:tcPr>
@@ -24693,6 +25021,7 @@
       <w:tr>
         <w:trPr>
           <w:trHeight w:val="360" w:hRule="atLeast"/>
+          <w:cantSplit/>
         </w:trPr>
         <w:tc>
           <w:tcPr>
@@ -24926,6 +25255,7 @@
       <w:tr>
         <w:trPr>
           <w:trHeight w:val="360" w:hRule="atLeast"/>
+          <w:cantSplit/>
         </w:trPr>
         <w:tc>
           <w:tcPr>
@@ -25159,6 +25489,7 @@
       <w:tr>
         <w:trPr>
           <w:trHeight w:val="360" w:hRule="atLeast"/>
+          <w:cantSplit/>
         </w:trPr>
         <w:tc>
           <w:tcPr>
@@ -25392,6 +25723,7 @@
       <w:tr>
         <w:trPr>
           <w:trHeight w:val="360" w:hRule="atLeast"/>
+          <w:cantSplit/>
         </w:trPr>
         <w:tc>
           <w:tcPr>
@@ -25625,6 +25957,8 @@
     </w:tbl>
     <w:p>
       <w:pPr>
+        <w:keepNext/>
+        <w:pageBreakBefore/>
         <w:spacing w:after="40" w:before="140"/>
       </w:pPr>
       <w:r>
@@ -25638,7 +25972,11 @@
           <w:sz w:val="26"/>
           <w:szCs w:val="26"/>
         </w:rPr>
-        <w:t xml:space="preserve">ISOLATION SKETCH / DIAGRAM</w:t>
+        <w:t>ISOLATION (LOTO) PERMIT CONTINUED</w:t>
+        <w:br/>
+        <w:t>Permit No.: __________   Date: __________</w:t>
+        <w:br/>
+        <w:t>ISOLATION SKETCH / DIAGRAM</w:t>
       </w:r>
     </w:p>
     <w:tbl>
@@ -25659,6 +25997,7 @@
       <w:tr>
         <w:trPr>
           <w:trHeight w:val="2400" w:hRule="atLeast"/>
+          <w:cantSplit/>
         </w:trPr>
         <w:tc>
           <w:tcPr>
@@ -25715,7 +26054,7 @@
           <w:sz w:val="26"/>
           <w:szCs w:val="26"/>
         </w:rPr>
-        <w:t xml:space="preserve">VERIFICATION (Step 5 — before work begins)</w:t>
+        <w:t>VERIFICATION (Step 5, before work begins)</w:t>
       </w:r>
     </w:p>
     <w:tbl>
@@ -25737,6 +26076,7 @@
       <w:tr>
         <w:trPr>
           <w:trHeight w:val="360" w:hRule="atLeast"/>
+          <w:cantSplit/>
         </w:trPr>
         <w:tc>
           <w:tcPr>
@@ -25773,7 +26113,7 @@
                 <w:sz w:val="22"/>
                 <w:szCs w:val="22"/>
               </w:rPr>
-              <w:t xml:space="preserve">Try-start performed — equipment does not activate</w:t>
+              <w:t>Try-start performed: equipment does not activate</w:t>
             </w:r>
           </w:p>
         </w:tc>
@@ -25819,6 +26159,7 @@
       <w:tr>
         <w:trPr>
           <w:trHeight w:val="360" w:hRule="atLeast"/>
+          <w:cantSplit/>
         </w:trPr>
         <w:tc>
           <w:tcPr>
@@ -25901,6 +26242,7 @@
       <w:tr>
         <w:trPr>
           <w:trHeight w:val="360" w:hRule="atLeast"/>
+          <w:cantSplit/>
         </w:trPr>
         <w:tc>
           <w:tcPr>
@@ -26018,6 +26360,7 @@
       <w:tr>
         <w:trPr>
           <w:trHeight w:val="420" w:hRule="atLeast"/>
+          <w:cantSplit/>
         </w:trPr>
         <w:tc>
           <w:tcPr>
@@ -26054,7 +26397,7 @@
                 <w:sz w:val="22"/>
                 <w:szCs w:val="22"/>
               </w:rPr>
-              <w:t xml:space="preserve">Responsible Person — name &amp; signature</w:t>
+              <w:t>Responsible Person: name and signature</w:t>
             </w:r>
           </w:p>
         </w:tc>
@@ -26100,6 +26443,7 @@
       <w:tr>
         <w:trPr>
           <w:trHeight w:val="420" w:hRule="atLeast"/>
+          <w:cantSplit/>
         </w:trPr>
         <w:tc>
           <w:tcPr>
@@ -26136,7 +26480,7 @@
                 <w:sz w:val="22"/>
                 <w:szCs w:val="22"/>
               </w:rPr>
-              <w:t xml:space="preserve">Work Leader — name &amp; signature</w:t>
+              <w:t>Work Leader: name and signature</w:t>
             </w:r>
           </w:p>
         </w:tc>
@@ -26217,6 +26561,7 @@
       <w:tr>
         <w:trPr>
           <w:trHeight w:val="360" w:hRule="atLeast"/>
+          <w:cantSplit/>
         </w:trPr>
         <w:tc>
           <w:tcPr>
@@ -26299,6 +26644,7 @@
       <w:tr>
         <w:trPr>
           <w:trHeight w:val="360" w:hRule="atLeast"/>
+          <w:cantSplit/>
         </w:trPr>
         <w:tc>
           <w:tcPr>
@@ -26381,6 +26727,7 @@
       <w:tr>
         <w:trPr>
           <w:trHeight w:val="400" w:hRule="atLeast"/>
+          <w:cantSplit/>
         </w:trPr>
         <w:tc>
           <w:tcPr>
@@ -26417,7 +26764,7 @@
                 <w:sz w:val="22"/>
                 <w:szCs w:val="22"/>
               </w:rPr>
-              <w:t xml:space="preserve">Responsible Person — name &amp; signature</w:t>
+              <w:t>Responsible Person: name and signature</w:t>
             </w:r>
           </w:p>
         </w:tc>
@@ -26463,6 +26810,7 @@
       <w:tr>
         <w:trPr>
           <w:trHeight w:val="400" w:hRule="atLeast"/>
+          <w:cantSplit/>
         </w:trPr>
         <w:tc>
           <w:tcPr>
@@ -26499,7 +26847,7 @@
                 <w:sz w:val="22"/>
                 <w:szCs w:val="22"/>
               </w:rPr>
-              <w:t xml:space="preserve">Work Leader — name &amp; signature</w:t>
+              <w:t>Work Leader: name and signature</w:t>
             </w:r>
           </w:p>
         </w:tc>
@@ -26595,6 +26943,9 @@
         <w:gridCol w:w="1266"/>
       </w:tblGrid>
       <w:tr>
+        <w:trPr>
+          <w:cantSplit/>
+        </w:trPr>
         <w:tc>
           <w:tcPr>
             <w:tcW w:type="dxa" w:w="1000"/>
@@ -26911,6 +27262,7 @@
       <w:tr>
         <w:trPr>
           <w:trHeight w:val="340" w:hRule="atLeast"/>
+          <w:cantSplit/>
         </w:trPr>
         <w:tc>
           <w:tcPr>
@@ -27220,6 +27572,7 @@
       <w:tr>
         <w:trPr>
           <w:trHeight w:val="340" w:hRule="atLeast"/>
+          <w:cantSplit/>
         </w:trPr>
         <w:tc>
           <w:tcPr>
@@ -27529,6 +27882,7 @@
       <w:tr>
         <w:trPr>
           <w:trHeight w:val="340" w:hRule="atLeast"/>
+          <w:cantSplit/>
         </w:trPr>
         <w:tc>
           <w:tcPr>
@@ -27838,6 +28192,7 @@
       <w:tr>
         <w:trPr>
           <w:trHeight w:val="340" w:hRule="atLeast"/>
+          <w:cantSplit/>
         </w:trPr>
         <w:tc>
           <w:tcPr>
@@ -28147,6 +28502,7 @@
       <w:tr>
         <w:trPr>
           <w:trHeight w:val="340" w:hRule="atLeast"/>
+          <w:cantSplit/>
         </w:trPr>
         <w:tc>
           <w:tcPr>
@@ -28456,6 +28812,7 @@
       <w:tr>
         <w:trPr>
           <w:trHeight w:val="340" w:hRule="atLeast"/>
+          <w:cantSplit/>
         </w:trPr>
         <w:tc>
           <w:tcPr>
@@ -28765,6 +29122,7 @@
       <w:tr>
         <w:trPr>
           <w:trHeight w:val="340" w:hRule="atLeast"/>
+          <w:cantSplit/>
         </w:trPr>
         <w:tc>
           <w:tcPr>
@@ -29074,6 +29432,7 @@
       <w:tr>
         <w:trPr>
           <w:trHeight w:val="340" w:hRule="atLeast"/>
+          <w:cantSplit/>
         </w:trPr>
         <w:tc>
           <w:tcPr>
@@ -29383,6 +29742,7 @@
       <w:tr>
         <w:trPr>
           <w:trHeight w:val="340" w:hRule="atLeast"/>
+          <w:cantSplit/>
         </w:trPr>
         <w:tc>
           <w:tcPr>
@@ -29692,6 +30052,7 @@
       <w:tr>
         <w:trPr>
           <w:trHeight w:val="340" w:hRule="atLeast"/>
+          <w:cantSplit/>
         </w:trPr>
         <w:tc>
           <w:tcPr>
@@ -30001,6 +30362,7 @@
       <w:tr>
         <w:trPr>
           <w:trHeight w:val="340" w:hRule="atLeast"/>
+          <w:cantSplit/>
         </w:trPr>
         <w:tc>
           <w:tcPr>
@@ -30310,6 +30672,7 @@
       <w:tr>
         <w:trPr>
           <w:trHeight w:val="340" w:hRule="atLeast"/>
+          <w:cantSplit/>
         </w:trPr>
         <w:tc>
           <w:tcPr>
@@ -30619,6 +30982,7 @@
       <w:tr>
         <w:trPr>
           <w:trHeight w:val="340" w:hRule="atLeast"/>
+          <w:cantSplit/>
         </w:trPr>
         <w:tc>
           <w:tcPr>
@@ -30928,6 +31292,7 @@
       <w:tr>
         <w:trPr>
           <w:trHeight w:val="340" w:hRule="atLeast"/>
+          <w:cantSplit/>
         </w:trPr>
         <w:tc>
           <w:tcPr>
@@ -31237,6 +31602,7 @@
       <w:tr>
         <w:trPr>
           <w:trHeight w:val="340" w:hRule="atLeast"/>
+          <w:cantSplit/>
         </w:trPr>
         <w:tc>
           <w:tcPr>
@@ -31546,6 +31912,7 @@
       <w:tr>
         <w:trPr>
           <w:trHeight w:val="340" w:hRule="atLeast"/>
+          <w:cantSplit/>
         </w:trPr>
         <w:tc>
           <w:tcPr>
@@ -31855,6 +32222,7 @@
       <w:tr>
         <w:trPr>
           <w:trHeight w:val="340" w:hRule="atLeast"/>
+          <w:cantSplit/>
         </w:trPr>
         <w:tc>
           <w:tcPr>
@@ -32164,6 +32532,7 @@
       <w:tr>
         <w:trPr>
           <w:trHeight w:val="340" w:hRule="atLeast"/>
+          <w:cantSplit/>
         </w:trPr>
         <w:tc>
           <w:tcPr>
@@ -32473,6 +32842,7 @@
       <w:tr>
         <w:trPr>
           <w:trHeight w:val="340" w:hRule="atLeast"/>
+          <w:cantSplit/>
         </w:trPr>
         <w:tc>
           <w:tcPr>
@@ -32782,6 +33152,7 @@
       <w:tr>
         <w:trPr>
           <w:trHeight w:val="340" w:hRule="atLeast"/>
+          <w:cantSplit/>
         </w:trPr>
         <w:tc>
           <w:tcPr>
@@ -33091,6 +33462,7 @@
       <w:tr>
         <w:trPr>
           <w:trHeight w:val="340" w:hRule="atLeast"/>
+          <w:cantSplit/>
         </w:trPr>
         <w:tc>
           <w:tcPr>
@@ -33400,6 +33772,7 @@
       <w:tr>
         <w:trPr>
           <w:trHeight w:val="340" w:hRule="atLeast"/>
+          <w:cantSplit/>
         </w:trPr>
         <w:tc>
           <w:tcPr>
@@ -33709,6 +34082,7 @@
       <w:tr>
         <w:trPr>
           <w:trHeight w:val="340" w:hRule="atLeast"/>
+          <w:cantSplit/>
         </w:trPr>
         <w:tc>
           <w:tcPr>
@@ -34018,6 +34392,7 @@
       <w:tr>
         <w:trPr>
           <w:trHeight w:val="340" w:hRule="atLeast"/>
+          <w:cantSplit/>
         </w:trPr>
         <w:tc>
           <w:tcPr>
@@ -34327,6 +34702,7 @@
       <w:tr>
         <w:trPr>
           <w:trHeight w:val="340" w:hRule="atLeast"/>
+          <w:cantSplit/>
         </w:trPr>
         <w:tc>
           <w:tcPr>

</xml_diff>